<commit_message>
Email for J. Pippuri-Makelainen; criteria for the industrial running machine
Her email puts the permission question before the invitation, because
nine chapters rest on the Voltcar machine and a late refusal would cost
the mobile half of the book. It asks what the consortium agreement
allows and whether others must agree, then offers the Voltcar section
of Chapter 13 as a co-authorship. The letter of support waits for the
follow-up.

Also records what the industrial running machine has to supply chapter
by chapter, since its source is still unconfirmed, and notes why a
machine documented in a published dissertation is attractive: it is
already cleared for publication, which the compressor case is not.

Co-Authored-By: Claude Opus 5 <noreply@anthropic.com>
Claude-Session: https://claude.ai/code/session_01YTsySEafbpGxYLQMAGUGjT
</commit_message>
<xml_diff>
--- a/chapter1/Chapter_Ownership.docx
+++ b/chapter1/Chapter_Ownership.docx
@@ -1017,6 +1017,598 @@
       </w:pPr>
       <w:r>
         <w:t>ask what the consortium agreement says rather than only what she personally thinks.</w:t>
+      </w:r>
+    </w:p>
+    <w:p>
+      <w:pPr>
+        <w:pStyle w:val="Heading2"/>
+      </w:pPr>
+      <w:r>
+        <w:t>The other running machine is still unattached</w:t>
+      </w:r>
+    </w:p>
+    <w:p>
+      <w:pPr>
+        <w:jc w:val="both"/>
+      </w:pPr>
+      <w:r>
+        <w:t>The industrial running machine is described throughout as "a two-pole gearless compressor</w:t>
+      </w:r>
+    </w:p>
+    <w:p>
+      <w:pPr>
+        <w:jc w:val="both"/>
+      </w:pPr>
+      <w:r>
+        <w:t>drive" and has no confirmed source. Saari was the assumed one; he is taking a chapter</w:t>
+      </w:r>
+    </w:p>
+    <w:p>
+      <w:pPr>
+        <w:jc w:val="both"/>
+      </w:pPr>
+      <w:r>
+        <w:t>rather than the case study, and has in any event moved employer. Ikäheimo at ABB is a</w:t>
+      </w:r>
+    </w:p>
+    <w:p>
+      <w:pPr>
+        <w:jc w:val="both"/>
+      </w:pPr>
+      <w:r>
+        <w:t>candidate, and a machine documented in a published dissertation is another.</w:t>
+      </w:r>
+    </w:p>
+    <w:p>
+      <w:pPr>
+        <w:jc w:val="both"/>
+      </w:pPr>
+      <w:r>
+        <w:t>A published machine has one decisive advantage over an industrial one: **it is already</w:t>
+      </w:r>
+    </w:p>
+    <w:p>
+      <w:pPr>
+        <w:jc w:val="both"/>
+      </w:pPr>
+      <w:r>
+        <w:t>cleared.** No employer has to be asked, no consortium has to agree, and the figures can be</w:t>
+      </w:r>
+    </w:p>
+    <w:p>
+      <w:pPr>
+        <w:jc w:val="both"/>
+      </w:pPr>
+      <w:r>
+        <w:t>reproduced with a citation. Set against the compressor case, whose clearance is the largest</w:t>
+      </w:r>
+    </w:p>
+    <w:p>
+      <w:pPr>
+        <w:jc w:val="both"/>
+      </w:pPr>
+      <w:r>
+        <w:t>unresolved risk in the plan, that is worth a great deal.</w:t>
+      </w:r>
+    </w:p>
+    <w:p>
+      <w:pPr>
+        <w:jc w:val="both"/>
+      </w:pPr>
+      <w:r>
+        <w:t>What the industrial running machine has to carry, chapter by chapter, before it can be</w:t>
+      </w:r>
+    </w:p>
+    <w:p>
+      <w:pPr>
+        <w:jc w:val="both"/>
+      </w:pPr>
+      <w:r>
+        <w:t>adopted:</w:t>
+      </w:r>
+    </w:p>
+    <w:tbl>
+      <w:tblPr>
+        <w:tblStyle w:val="LightGrid-Accent1"/>
+        <w:tblW w:type="auto" w:w="0"/>
+        <w:jc w:val="center"/>
+        <w:tblLook w:firstColumn="1" w:firstRow="1" w:lastColumn="0" w:lastRow="0" w:noHBand="0" w:noVBand="1" w:val="04A0"/>
+      </w:tblPr>
+      <w:tblGrid>
+        <w:gridCol w:w="4320"/>
+        <w:gridCol w:w="4320"/>
+      </w:tblGrid>
+      <w:tr>
+        <w:tc>
+          <w:tcPr>
+            <w:tcW w:type="dxa" w:w="4320"/>
+          </w:tcPr>
+          <w:p>
+            <w:r>
+              <w:rPr>
+                <w:b/>
+                <w:sz w:val="19"/>
+              </w:rPr>
+            </w:r>
+            <w:r>
+              <w:rPr>
+                <w:b/>
+                <w:sz w:val="19"/>
+              </w:rPr>
+              <w:t>Chapter</w:t>
+            </w:r>
+          </w:p>
+        </w:tc>
+        <w:tc>
+          <w:tcPr>
+            <w:tcW w:type="dxa" w:w="4320"/>
+          </w:tcPr>
+          <w:p>
+            <w:r>
+              <w:rPr>
+                <w:b/>
+                <w:sz w:val="19"/>
+              </w:rPr>
+            </w:r>
+            <w:r>
+              <w:rPr>
+                <w:b/>
+                <w:sz w:val="19"/>
+              </w:rPr>
+              <w:t>What it must supply</w:t>
+            </w:r>
+          </w:p>
+        </w:tc>
+      </w:tr>
+      <w:tr>
+        <w:tc>
+          <w:tcPr>
+            <w:tcW w:type="dxa" w:w="4320"/>
+          </w:tcPr>
+          <w:p>
+            <w:r>
+              <w:rPr>
+                <w:sz w:val="19"/>
+              </w:rPr>
+            </w:r>
+            <w:r>
+              <w:rPr>
+                <w:sz w:val="19"/>
+              </w:rPr>
+              <w:t>2</w:t>
+            </w:r>
+          </w:p>
+        </w:tc>
+        <w:tc>
+          <w:tcPr>
+            <w:tcW w:type="dxa" w:w="4320"/>
+          </w:tcPr>
+          <w:p>
+            <w:r>
+              <w:rPr>
+                <w:sz w:val="19"/>
+              </w:rPr>
+            </w:r>
+            <w:r>
+              <w:rPr>
+                <w:sz w:val="19"/>
+              </w:rPr>
+              <w:t>A genuine industrial application, judged on availability and total cost of ownership, not a laboratory demonstrator</w:t>
+            </w:r>
+          </w:p>
+        </w:tc>
+      </w:tr>
+      <w:tr>
+        <w:tc>
+          <w:tcPr>
+            <w:tcW w:type="dxa" w:w="4320"/>
+          </w:tcPr>
+          <w:p>
+            <w:r>
+              <w:rPr>
+                <w:sz w:val="19"/>
+              </w:rPr>
+            </w:r>
+            <w:r>
+              <w:rPr>
+                <w:sz w:val="19"/>
+              </w:rPr>
+              <w:t>4</w:t>
+            </w:r>
+          </w:p>
+        </w:tc>
+        <w:tc>
+          <w:tcPr>
+            <w:tcW w:type="dxa" w:w="4320"/>
+          </w:tcPr>
+          <w:p>
+            <w:r>
+              <w:rPr>
+                <w:sz w:val="19"/>
+              </w:rPr>
+            </w:r>
+            <w:r>
+              <w:rPr>
+                <w:sz w:val="19"/>
+              </w:rPr>
+              <w:t>Rotor retention: sleeve or bridge design, interference fits, overspeed margin</w:t>
+            </w:r>
+          </w:p>
+        </w:tc>
+      </w:tr>
+      <w:tr>
+        <w:tc>
+          <w:tcPr>
+            <w:tcW w:type="dxa" w:w="4320"/>
+          </w:tcPr>
+          <w:p>
+            <w:r>
+              <w:rPr>
+                <w:sz w:val="19"/>
+              </w:rPr>
+            </w:r>
+            <w:r>
+              <w:rPr>
+                <w:sz w:val="19"/>
+              </w:rPr>
+              <w:t>5</w:t>
+            </w:r>
+          </w:p>
+        </w:tc>
+        <w:tc>
+          <w:tcPr>
+            <w:tcW w:type="dxa" w:w="4320"/>
+          </w:tcPr>
+          <w:p>
+            <w:r>
+              <w:rPr>
+                <w:sz w:val="19"/>
+              </w:rPr>
+            </w:r>
+            <w:r>
+              <w:rPr>
+                <w:sz w:val="19"/>
+              </w:rPr>
+              <w:t>Rotordynamics: bearing span, critical speeds, mode shapes, sub- or supercritical operation</w:t>
+            </w:r>
+          </w:p>
+        </w:tc>
+      </w:tr>
+      <w:tr>
+        <w:tc>
+          <w:tcPr>
+            <w:tcW w:type="dxa" w:w="4320"/>
+          </w:tcPr>
+          <w:p>
+            <w:r>
+              <w:rPr>
+                <w:sz w:val="19"/>
+              </w:rPr>
+            </w:r>
+            <w:r>
+              <w:rPr>
+                <w:sz w:val="19"/>
+              </w:rPr>
+              <w:t>6</w:t>
+            </w:r>
+          </w:p>
+        </w:tc>
+        <w:tc>
+          <w:tcPr>
+            <w:tcW w:type="dxa" w:w="4320"/>
+          </w:tcPr>
+          <w:p>
+            <w:r>
+              <w:rPr>
+                <w:sz w:val="19"/>
+              </w:rPr>
+            </w:r>
+            <w:r>
+              <w:rPr>
+                <w:sz w:val="19"/>
+              </w:rPr>
+              <w:t>Bearing type, lubrication arrangement, and ideally life or service experience</w:t>
+            </w:r>
+          </w:p>
+        </w:tc>
+      </w:tr>
+      <w:tr>
+        <w:tc>
+          <w:tcPr>
+            <w:tcW w:type="dxa" w:w="4320"/>
+          </w:tcPr>
+          <w:p>
+            <w:r>
+              <w:rPr>
+                <w:sz w:val="19"/>
+              </w:rPr>
+            </w:r>
+            <w:r>
+              <w:rPr>
+                <w:sz w:val="19"/>
+              </w:rPr>
+              <w:t>7</w:t>
+            </w:r>
+          </w:p>
+        </w:tc>
+        <w:tc>
+          <w:tcPr>
+            <w:tcW w:type="dxa" w:w="4320"/>
+          </w:tcPr>
+          <w:p>
+            <w:r>
+              <w:rPr>
+                <w:sz w:val="19"/>
+              </w:rPr>
+            </w:r>
+            <w:r>
+              <w:rPr>
+                <w:sz w:val="19"/>
+              </w:rPr>
+              <w:t>Complete electromagnetic dimensions, enough to re-run the sizing procedure</w:t>
+            </w:r>
+          </w:p>
+        </w:tc>
+      </w:tr>
+      <w:tr>
+        <w:tc>
+          <w:tcPr>
+            <w:tcW w:type="dxa" w:w="4320"/>
+          </w:tcPr>
+          <w:p>
+            <w:r>
+              <w:rPr>
+                <w:sz w:val="19"/>
+              </w:rPr>
+            </w:r>
+            <w:r>
+              <w:rPr>
+                <w:sz w:val="19"/>
+              </w:rPr>
+              <w:t>8</w:t>
+            </w:r>
+          </w:p>
+        </w:tc>
+        <w:tc>
+          <w:tcPr>
+            <w:tcW w:type="dxa" w:w="4320"/>
+          </w:tcPr>
+          <w:p>
+            <w:r>
+              <w:rPr>
+                <w:sz w:val="19"/>
+              </w:rPr>
+            </w:r>
+            <w:r>
+              <w:rPr>
+                <w:sz w:val="19"/>
+              </w:rPr>
+              <w:t>Conductor and winding design</w:t>
+            </w:r>
+          </w:p>
+        </w:tc>
+      </w:tr>
+      <w:tr>
+        <w:tc>
+          <w:tcPr>
+            <w:tcW w:type="dxa" w:w="4320"/>
+          </w:tcPr>
+          <w:p>
+            <w:r>
+              <w:rPr>
+                <w:sz w:val="19"/>
+              </w:rPr>
+            </w:r>
+            <w:r>
+              <w:rPr>
+                <w:sz w:val="19"/>
+              </w:rPr>
+              <w:t>9</w:t>
+            </w:r>
+          </w:p>
+        </w:tc>
+        <w:tc>
+          <w:tcPr>
+            <w:tcW w:type="dxa" w:w="4320"/>
+          </w:tcPr>
+          <w:p>
+            <w:r>
+              <w:rPr>
+                <w:sz w:val="19"/>
+              </w:rPr>
+            </w:r>
+            <w:r>
+              <w:rPr>
+                <w:sz w:val="19"/>
+              </w:rPr>
+              <w:t>Measured losses, segregated</w:t>
+            </w:r>
+          </w:p>
+        </w:tc>
+      </w:tr>
+      <w:tr>
+        <w:tc>
+          <w:tcPr>
+            <w:tcW w:type="dxa" w:w="4320"/>
+          </w:tcPr>
+          <w:p>
+            <w:r>
+              <w:rPr>
+                <w:sz w:val="19"/>
+              </w:rPr>
+            </w:r>
+            <w:r>
+              <w:rPr>
+                <w:sz w:val="19"/>
+              </w:rPr>
+              <w:t>10</w:t>
+            </w:r>
+          </w:p>
+        </w:tc>
+        <w:tc>
+          <w:tcPr>
+            <w:tcW w:type="dxa" w:w="4320"/>
+          </w:tcPr>
+          <w:p>
+            <w:r>
+              <w:rPr>
+                <w:sz w:val="19"/>
+              </w:rPr>
+            </w:r>
+            <w:r>
+              <w:rPr>
+                <w:sz w:val="19"/>
+              </w:rPr>
+              <w:t>Cooling arrangement and measured temperatures</w:t>
+            </w:r>
+          </w:p>
+        </w:tc>
+      </w:tr>
+      <w:tr>
+        <w:tc>
+          <w:tcPr>
+            <w:tcW w:type="dxa" w:w="4320"/>
+          </w:tcPr>
+          <w:p>
+            <w:r>
+              <w:rPr>
+                <w:sz w:val="19"/>
+              </w:rPr>
+            </w:r>
+            <w:r>
+              <w:rPr>
+                <w:sz w:val="19"/>
+              </w:rPr>
+              <w:t>11</w:t>
+            </w:r>
+          </w:p>
+        </w:tc>
+        <w:tc>
+          <w:tcPr>
+            <w:tcW w:type="dxa" w:w="4320"/>
+          </w:tcPr>
+          <w:p>
+            <w:r>
+              <w:rPr>
+                <w:sz w:val="19"/>
+              </w:rPr>
+            </w:r>
+            <w:r>
+              <w:rPr>
+                <w:sz w:val="19"/>
+              </w:rPr>
+              <w:t>The converter it runs on: device family, switching frequency, resulting pulse ratio</w:t>
+            </w:r>
+          </w:p>
+        </w:tc>
+      </w:tr>
+      <w:tr>
+        <w:tc>
+          <w:tcPr>
+            <w:tcW w:type="dxa" w:w="4320"/>
+          </w:tcPr>
+          <w:p>
+            <w:r>
+              <w:rPr>
+                <w:sz w:val="19"/>
+              </w:rPr>
+            </w:r>
+            <w:r>
+              <w:rPr>
+                <w:sz w:val="19"/>
+              </w:rPr>
+              <w:t>12</w:t>
+            </w:r>
+          </w:p>
+        </w:tc>
+        <w:tc>
+          <w:tcPr>
+            <w:tcW w:type="dxa" w:w="4320"/>
+          </w:tcPr>
+          <w:p>
+            <w:r>
+              <w:rPr>
+                <w:sz w:val="19"/>
+              </w:rPr>
+            </w:r>
+            <w:r>
+              <w:rPr>
+                <w:sz w:val="19"/>
+              </w:rPr>
+              <w:t>Assembled design, measured performance, and ideally qualification against standards</w:t>
+            </w:r>
+          </w:p>
+        </w:tc>
+      </w:tr>
+    </w:tbl>
+    <w:p>
+      <w:pPr>
+        <w:spacing w:after="120"/>
+      </w:pPr>
+    </w:p>
+    <w:p>
+      <w:pPr>
+        <w:jc w:val="both"/>
+      </w:pPr>
+      <w:r>
+        <w:t xml:space="preserve">Two further tests. It should be </w:t>
+      </w:r>
+      <w:r>
+        <w:rPr>
+          <w:b/>
+        </w:rPr>
+        <w:t>recent enough</w:t>
+      </w:r>
+      <w:r>
+        <w:t xml:space="preserve"> that a reviewer does not read the book as</w:t>
+      </w:r>
+    </w:p>
+    <w:p>
+      <w:pPr>
+        <w:jc w:val="both"/>
+      </w:pPr>
+      <w:r>
+        <w:t>retrospective, since the editor asked for updated applications. And it should sit clearly</w:t>
+      </w:r>
+    </w:p>
+    <w:p>
+      <w:pPr>
+        <w:jc w:val="both"/>
+      </w:pPr>
+      <w:r>
+        <w:t>in the industrial paradigm, so that the contrast with the mobile machine carries the weight</w:t>
+      </w:r>
+    </w:p>
+    <w:p>
+      <w:pPr>
+        <w:jc w:val="both"/>
+      </w:pPr>
+      <w:r>
+        <w:t>the book puts on it.</w:t>
+      </w:r>
+    </w:p>
+    <w:p>
+      <w:pPr>
+        <w:jc w:val="both"/>
+      </w:pPr>
+      <w:r>
+        <w:t>A doctoral dissertation is an unusually good source for this, because it normally documents</w:t>
+      </w:r>
+    </w:p>
+    <w:p>
+      <w:pPr>
+        <w:jc w:val="both"/>
+      </w:pPr>
+      <w:r>
+        <w:t>mechanical, electromagnetic, thermal and drive aspects of one machine in a single place,</w:t>
+      </w:r>
+    </w:p>
+    <w:p>
+      <w:pPr>
+        <w:jc w:val="both"/>
+      </w:pPr>
+      <w:r>
+        <w:t>which is exactly what a running machine needs and what a journal paper never provides.</w:t>
       </w:r>
     </w:p>
     <w:sectPr>

</xml_diff>

<commit_message>
Review the fourteen-chapter ownership map
Records four points on the proposed structure. The authors would write
23 per cent of their own book, ninety-six pages of four hundred and
twelve, and both case-study chapters would leave their hands, so the
method argued for over seven chapters is never demonstrated by its
authors; Chapter 13 should return to them, since the industrial running
machine is LUT's own and its test data unpublished. Chapter 14 has lost
the aerospace generator and the e-turbocharger, which costs the book
its speed range and the applications the editor asked about. Chapter 13
carries two owners and the wrong specialism for its first section. And
nobody owns the aerodynamic losses of Chapter 9, since Rasilo is a
core-loss specialist.

Co-Authored-By: Claude Opus 5 <noreply@anthropic.com>
Claude-Session: https://claude.ai/code/session_01YTsySEafbpGxYLQMAGUGjT
</commit_message>
<xml_diff>
--- a/chapter1/Chapter_Ownership.docx
+++ b/chapter1/Chapter_Ownership.docx
@@ -2456,6 +2456,547 @@
         <w:t>drive currently in the plan. Recommend adopting it subject to that one question.</w:t>
       </w:r>
     </w:p>
+    <w:p>
+      <w:pPr>
+        <w:pStyle w:val="Heading2"/>
+      </w:pPr>
+      <w:r>
+        <w:t>Review of the fourteen-chapter ownership map</w:t>
+      </w:r>
+    </w:p>
+    <w:p>
+      <w:pPr>
+        <w:jc w:val="both"/>
+      </w:pPr>
+      <w:r>
+        <w:t>The map is a real improvement. Every chapter has one owner; Hinkkanen gets Chapter 12 and</w:t>
+      </w:r>
+    </w:p>
+    <w:p>
+      <w:pPr>
+        <w:jc w:val="both"/>
+      </w:pPr>
+      <w:r>
+        <w:t>the awkwardness of a peer professor writing inside Peltoniemi's chapter disappears; Rasilo</w:t>
+      </w:r>
+    </w:p>
+    <w:p>
+      <w:pPr>
+        <w:jc w:val="both"/>
+      </w:pPr>
+      <w:r>
+        <w:t>is an excellent name for core losses and adds Tampere to a list that was LUT, Aalto and</w:t>
+      </w:r>
+    </w:p>
+    <w:p>
+      <w:pPr>
+        <w:jc w:val="both"/>
+      </w:pPr>
+      <w:r>
+        <w:t>Newcastle; and the page budget still lands at 452 against the 450 target. Four things</w:t>
+      </w:r>
+    </w:p>
+    <w:p>
+      <w:pPr>
+        <w:jc w:val="both"/>
+      </w:pPr>
+      <w:r>
+        <w:t>should be settled before it goes out.</w:t>
+      </w:r>
+    </w:p>
+    <w:p>
+      <w:pPr>
+        <w:pStyle w:val="Heading3"/>
+      </w:pPr>
+      <w:r>
+        <w:t>1. The authors would write 23 per cent of their own book</w:t>
+      </w:r>
+    </w:p>
+    <w:p>
+      <w:pPr>
+        <w:jc w:val="both"/>
+      </w:pPr>
+      <w:r>
+        <w:t>Chapters 1, 3 and 7, ninety-six pages of four hundred and twelve. Wiley is being asked for</w:t>
+      </w:r>
+    </w:p>
+    <w:p>
+      <w:pPr>
+        <w:jc w:val="both"/>
+      </w:pPr>
+      <w:r>
+        <w:t>an authored book with three names on the cover; a reviewer who counts will see a contributed</w:t>
+      </w:r>
+    </w:p>
+    <w:p>
+      <w:pPr>
+        <w:jc w:val="both"/>
+      </w:pPr>
+      <w:r>
+        <w:t>volume with three editors. The earlier map had the authors on six chapters of thirteen.</w:t>
+      </w:r>
+    </w:p>
+    <w:p>
+      <w:pPr>
+        <w:jc w:val="both"/>
+      </w:pPr>
+      <w:r>
+        <w:t>What moved out matters more than the count. Chapters 13 and 14 are where the book's own</w:t>
+      </w:r>
+    </w:p>
+    <w:p>
+      <w:pPr>
+        <w:jc w:val="both"/>
+      </w:pPr>
+      <w:r>
+        <w:t>procedure is shown working on the two running machines. If both go to outsiders, the authors</w:t>
+      </w:r>
+    </w:p>
+    <w:p>
+      <w:pPr>
+        <w:jc w:val="both"/>
+      </w:pPr>
+      <w:r>
+        <w:t>never demonstrate the method they spent seven chapters arguing for.</w:t>
+      </w:r>
+    </w:p>
+    <w:p>
+      <w:pPr>
+        <w:jc w:val="both"/>
+      </w:pPr>
+      <w:r>
+        <w:t>The industrial running machine is now LUT's own 2 MW solid-rotor machine, supervised by two</w:t>
+      </w:r>
+    </w:p>
+    <w:p>
+      <w:pPr>
+        <w:jc w:val="both"/>
+      </w:pPr>
+      <w:r>
+        <w:t>of the three authors, and the test data is unpublished and in their hands. Chapter 13 should</w:t>
+      </w:r>
+    </w:p>
+    <w:p>
+      <w:pPr>
+        <w:jc w:val="both"/>
+      </w:pPr>
+      <w:r>
+        <w:t>therefore be the authors', with Tiainen and Jaatinen-Värri as co-authors for the compressor</w:t>
+      </w:r>
+    </w:p>
+    <w:p>
+      <w:pPr>
+        <w:jc w:val="both"/>
+      </w:pPr>
+      <w:r>
+        <w:t>and ORC side. That restores the authored-book balance to four chapters and about a third of</w:t>
+      </w:r>
+    </w:p>
+    <w:p>
+      <w:pPr>
+        <w:jc w:val="both"/>
+      </w:pPr>
+      <w:r>
+        <w:t>the text, and it puts the machine's own people in charge of reporting it.</w:t>
+      </w:r>
+    </w:p>
+    <w:p>
+      <w:pPr>
+        <w:jc w:val="both"/>
+      </w:pPr>
+      <w:r>
+        <w:t>Chapter 14 can stay with Pippuri-Mäkeläinen, because Voltcar is VTT's and the data is</w:t>
+      </w:r>
+    </w:p>
+    <w:p>
+      <w:pPr>
+        <w:jc w:val="both"/>
+      </w:pPr>
+      <w:r>
+        <w:t>theirs.</w:t>
+      </w:r>
+    </w:p>
+    <w:p>
+      <w:pPr>
+        <w:pStyle w:val="Heading3"/>
+      </w:pPr>
+      <w:r>
+        <w:t>2. Chapter 14 has lost the aerospace generator and the e-turbocharger</w:t>
+      </w:r>
+    </w:p>
+    <w:p>
+      <w:pPr>
+        <w:jc w:val="both"/>
+      </w:pPr>
+      <w:r>
+        <w:t xml:space="preserve">The title now reads </w:t>
+      </w:r>
+      <w:r>
+        <w:rPr>
+          <w:i/>
+        </w:rPr>
+        <w:t>Mobile case studies: traction</w:t>
+      </w:r>
+      <w:r>
+        <w:t>. One machine in thirty pages, and the</w:t>
+      </w:r>
+    </w:p>
+    <w:p>
+      <w:pPr>
+        <w:jc w:val="both"/>
+      </w:pPr>
+      <w:r>
+        <w:t>mobile paradigm is represented by a single 120 kW traction motor.</w:t>
+      </w:r>
+    </w:p>
+    <w:p>
+      <w:pPr>
+        <w:jc w:val="both"/>
+      </w:pPr>
+      <w:r>
+        <w:t>That costs three things. The e-turbocharger above 100 000 r/min is what makes the book's</w:t>
+      </w:r>
+    </w:p>
+    <w:p>
+      <w:pPr>
+        <w:jc w:val="both"/>
+      </w:pPr>
+      <w:r>
+        <w:t>claimed speed range credible; without it the highest speed in the book is 30 000 r/min.</w:t>
+      </w:r>
+    </w:p>
+    <w:p>
+      <w:pPr>
+        <w:jc w:val="both"/>
+      </w:pPr>
+      <w:r>
+        <w:t>Aerospace is the current market the editor asked about. And the closing section, where the</w:t>
+      </w:r>
+    </w:p>
+    <w:p>
+      <w:pPr>
+        <w:jc w:val="both"/>
+      </w:pPr>
+      <w:r>
+        <w:t>two paradigms are revisited with the completed designs in hand, needs range on the mobile</w:t>
+      </w:r>
+    </w:p>
+    <w:p>
+      <w:pPr>
+        <w:jc w:val="both"/>
+      </w:pPr>
+      <w:r>
+        <w:t>side or it compares one machine with one machine.</w:t>
+      </w:r>
+    </w:p>
+    <w:p>
+      <w:pPr>
+        <w:jc w:val="both"/>
+      </w:pPr>
+      <w:r>
+        <w:t>Keep the title and the three sections, and let Pippuri-Mäkeläinen recruit for the two she</w:t>
+      </w:r>
+    </w:p>
+    <w:p>
+      <w:pPr>
+        <w:jc w:val="both"/>
+      </w:pPr>
+      <w:r>
+        <w:t>cannot cover, exactly as Saari is being asked to do for the mobile applications in</w:t>
+      </w:r>
+    </w:p>
+    <w:p>
+      <w:pPr>
+        <w:jc w:val="both"/>
+      </w:pPr>
+      <w:r>
+        <w:t>Chapter 2.</w:t>
+      </w:r>
+    </w:p>
+    <w:p>
+      <w:pPr>
+        <w:pStyle w:val="Heading3"/>
+      </w:pPr>
+      <w:r>
+        <w:t>3. Chapter 13 has two owners</w:t>
+      </w:r>
+    </w:p>
+    <w:p>
+      <w:pPr>
+        <w:jc w:val="both"/>
+      </w:pPr>
+      <w:r>
+        <w:t>Tiainen and Jaatinen-Värri both. That is the arrangement the rule exists to prevent, unless</w:t>
+      </w:r>
+    </w:p>
+    <w:p>
+      <w:pPr>
+        <w:jc w:val="both"/>
+      </w:pPr>
+      <w:r>
+        <w:t>they are treated as one unit with one of them named as the contact, in the way Sopanen's</w:t>
+      </w:r>
+    </w:p>
+    <w:p>
+      <w:pPr>
+        <w:jc w:val="both"/>
+      </w:pPr>
+      <w:r>
+        <w:t>group is.</w:t>
+      </w:r>
+    </w:p>
+    <w:p>
+      <w:pPr>
+        <w:jc w:val="both"/>
+      </w:pPr>
+      <w:r>
+        <w:t>There is a second mismatch underneath it. They are turbomachinery people and the chapter's</w:t>
+      </w:r>
+    </w:p>
+    <w:p>
+      <w:pPr>
+        <w:jc w:val="both"/>
+      </w:pPr>
+      <w:r>
+        <w:t>first section is the measured performance of an electrical machine. They are the right</w:t>
+      </w:r>
+    </w:p>
+    <w:p>
+      <w:pPr>
+        <w:jc w:val="both"/>
+      </w:pPr>
+      <w:r>
+        <w:t>authors for the driven machine and the wrong ones for the motor. Section 1 above resolves</w:t>
+      </w:r>
+    </w:p>
+    <w:p>
+      <w:pPr>
+        <w:jc w:val="both"/>
+      </w:pPr>
+      <w:r>
+        <w:t>both: the authors own it, and the turbomachinery pair write the compressor and ORC side as</w:t>
+      </w:r>
+    </w:p>
+    <w:p>
+      <w:pPr>
+        <w:jc w:val="both"/>
+      </w:pPr>
+      <w:r>
+        <w:t>co-authors.</w:t>
+      </w:r>
+    </w:p>
+    <w:p>
+      <w:pPr>
+        <w:pStyle w:val="Heading3"/>
+      </w:pPr>
+      <w:r>
+        <w:t>4. Nobody owns the aerodynamic losses of Chapter 9</w:t>
+      </w:r>
+    </w:p>
+    <w:p>
+      <w:pPr>
+        <w:jc w:val="both"/>
+      </w:pPr>
+      <w:r>
+        <w:t xml:space="preserve">The chapter is </w:t>
+      </w:r>
+      <w:r>
+        <w:rPr>
+          <w:i/>
+        </w:rPr>
+        <w:t>Core, rotor and aerodynamic losses</w:t>
+      </w:r>
+      <w:r>
+        <w:t xml:space="preserve"> and Rasilo is a core-loss and</w:t>
+      </w:r>
+    </w:p>
+    <w:p>
+      <w:pPr>
+        <w:jc w:val="both"/>
+      </w:pPr>
+      <w:r>
+        <w:t>magnetic-materials specialist. Windage and Taylor–Couette flow are not his field, and it</w:t>
+      </w:r>
+    </w:p>
+    <w:p>
+      <w:pPr>
+        <w:jc w:val="both"/>
+      </w:pPr>
+      <w:r>
+        <w:t>would be unfair to hand them to him inside a chapter he owns.</w:t>
+      </w:r>
+    </w:p>
+    <w:p>
+      <w:pPr>
+        <w:jc w:val="both"/>
+      </w:pPr>
+      <w:r>
+        <w:t>Two ways out. Either he recruits Saari for §9.8, which is what the model is for and what</w:t>
+      </w:r>
+    </w:p>
+    <w:p>
+      <w:pPr>
+        <w:jc w:val="both"/>
+      </w:pPr>
+      <w:r>
+        <w:t>Saari has said he would like. Or the aerodynamic material moves into Chapter 10, where the</w:t>
+      </w:r>
+    </w:p>
+    <w:p>
+      <w:pPr>
+        <w:jc w:val="both"/>
+      </w:pPr>
+      <w:r>
+        <w:t>air-gap flow is already treated as one problem producing both windage and convection, and</w:t>
+      </w:r>
+    </w:p>
+    <w:p>
+      <w:pPr>
+        <w:jc w:val="both"/>
+      </w:pPr>
+      <w:r>
+        <w:t xml:space="preserve">Chapter 9 becomes </w:t>
+      </w:r>
+      <w:r>
+        <w:rPr>
+          <w:i/>
+        </w:rPr>
+        <w:t>Core and rotor losses at high speed</w:t>
+      </w:r>
+      <w:r>
+        <w:t>. The second is cleaner physically</w:t>
+      </w:r>
+    </w:p>
+    <w:p>
+      <w:pPr>
+        <w:jc w:val="both"/>
+      </w:pPr>
+      <w:r>
+        <w:t>and the proposal already argues for it; the first is easier and keeps Saari's name in the</w:t>
+      </w:r>
+    </w:p>
+    <w:p>
+      <w:pPr>
+        <w:jc w:val="both"/>
+      </w:pPr>
+      <w:r>
+        <w:t>book if he declines Chapter 2.</w:t>
+      </w:r>
+    </w:p>
+    <w:p>
+      <w:pPr>
+        <w:pStyle w:val="Heading3"/>
+      </w:pPr>
+      <w:r>
+        <w:t>Smaller points</w:t>
+      </w:r>
+    </w:p>
+    <w:p>
+      <w:pPr>
+        <w:pStyle w:val="ListBullet"/>
+      </w:pPr>
+      <w:r>
+        <w:rPr>
+          <w:b/>
+        </w:rPr>
+        <w:t>Chapter 3</w:t>
+      </w:r>
+      <w:r>
+        <w:t xml:space="preserve"> is marked "authors, plus perhaps someone for each machine type". Four or</w:t>
+      </w:r>
+    </w:p>
+    <w:p>
+      <w:pPr>
+        <w:jc w:val="both"/>
+      </w:pPr>
+      <w:r>
+        <w:t>five outside hands in one chapter is how the earlier problem started. Ikäheimo on the</w:t>
+      </w:r>
+    </w:p>
+    <w:p>
+      <w:pPr>
+        <w:jc w:val="both"/>
+      </w:pPr>
+      <w:r>
+        <w:t>induction machines is enough; anyone further should be his recruit, not a separate one.</w:t>
+      </w:r>
+    </w:p>
+    <w:p>
+      <w:pPr>
+        <w:pStyle w:val="ListBullet"/>
+      </w:pPr>
+      <w:r>
+        <w:rPr>
+          <w:b/>
+        </w:rPr>
+        <w:t>Belahcen</w:t>
+      </w:r>
+      <w:r>
+        <w:t xml:space="preserve"> was told he could lead one or two chapters on winding losses and on core and</w:t>
+      </w:r>
+    </w:p>
+    <w:p>
+      <w:pPr>
+        <w:jc w:val="both"/>
+      </w:pPr>
+      <w:r>
+        <w:t>rotor losses. He now has one. That is within what the email said, but he should hear it</w:t>
+      </w:r>
+    </w:p>
+    <w:p>
+      <w:pPr>
+        <w:jc w:val="both"/>
+      </w:pPr>
+      <w:r>
+        <w:t>from us rather than discover it in the table of contents, and Rasilo's name should be</w:t>
+      </w:r>
+    </w:p>
+    <w:p>
+      <w:pPr>
+        <w:jc w:val="both"/>
+      </w:pPr>
+      <w:r>
+        <w:t>mentioned to him before it is fixed.</w:t>
+      </w:r>
+    </w:p>
+    <w:p>
+      <w:pPr>
+        <w:pStyle w:val="ListBullet"/>
+      </w:pPr>
+      <w:r>
+        <w:rPr>
+          <w:b/>
+        </w:rPr>
+        <w:t>Splitting the drive chapter</w:t>
+      </w:r>
+      <w:r>
+        <w:t xml:space="preserve"> reintroduces the converter-and-control boundary the book</w:t>
+      </w:r>
+    </w:p>
+    <w:p>
+      <w:pPr>
+        <w:jc w:val="both"/>
+      </w:pPr>
+      <w:r>
+        <w:t>criticises elsewhere. Worth accepting for a named control owner, but Chapter 12 should</w:t>
+      </w:r>
+    </w:p>
+    <w:p>
+      <w:pPr>
+        <w:jc w:val="both"/>
+      </w:pPr>
+      <w:r>
+        <w:t>open by saying it continues Chapter 11, and the section matching each machine to its</w:t>
+      </w:r>
+    </w:p>
+    <w:p>
+      <w:pPr>
+        <w:jc w:val="both"/>
+      </w:pPr>
+      <w:r>
+        <w:t>converter should sit in one chapter, not be divided between them.</w:t>
+      </w:r>
+    </w:p>
     <w:sectPr>
       <w:pgSz w:w="12240" w:h="15840"/>
       <w:pgMar w:top="1440" w:right="1800" w:bottom="1440" w:left="1800" w:header="720" w:footer="720" w:gutter="0"/>

</xml_diff>